<commit_message>
feat: actualizar y agregar documentacion del proyecto Wani Connect
</commit_message>
<xml_diff>
--- a/Documents/ARC - 001 - Wani_Connect_Arquitectura.docx
+++ b/Documents/ARC - 001 - Wani_Connect_Arquitectura.docx
@@ -383,7 +383,7 @@
           <w:sz w:val="38"/>
           <w:szCs w:val="38"/>
         </w:rPr>
-        <w:t>Lunes</w:t>
+        <w:t>Martes</w:t>
       </w:r>
       <w:r>
         <w:rPr>
@@ -2901,23 +2901,7 @@
           <w:color w:val="000000"/>
           <w:sz w:val="24"/>
         </w:rPr>
-        <w:t>Panel administrativo web (</w:t>
-      </w:r>
-      <w:proofErr w:type="spellStart"/>
-      <w:r>
-        <w:rPr>
-          <w:color w:val="000000"/>
-          <w:sz w:val="24"/>
-        </w:rPr>
-        <w:t>Admin</w:t>
-      </w:r>
-      <w:proofErr w:type="spellEnd"/>
-      <w:r>
-        <w:rPr>
-          <w:color w:val="000000"/>
-          <w:sz w:val="24"/>
-        </w:rPr>
-        <w:t xml:space="preserve"> Panel): cliente web destinado a los administradores del sistema. Permite gestionar eventos, emprendimientos y usuarios, ejerciendo funciones de control y configuración no disponibles para los usuarios finales. Su comunicación con el backend utiliza el mismo protocolo REST descrito en la sección 9, lo que simplifica su integración con el resto de los clientes.</w:t>
+        <w:t>Panel administrativo web (Admin Panel): cliente web destinado a los administradores del sistema. Permite gestionar eventos, emprendimientos y usuarios, ejerciendo funciones de control y configuración no disponibles para los usuarios finales. Su comunicación con el backend utiliza el mismo protocolo REST descrito en la sección 9, lo que simplifica su integración con el resto de los clientes.</w:t>
       </w:r>
     </w:p>
     <w:p>
@@ -3002,23 +2986,7 @@
           <w:color w:val="000000"/>
           <w:sz w:val="24"/>
         </w:rPr>
-        <w:t xml:space="preserve">El backend, desarrollado en Spring Boot, actúa como servidor central del sistema y concentra la lógica de negocio, la exposición de los servicios REST y el acceso a los datos (secciones 3 y 4). Es el único componente con capacidad de interactuar con la base de datos SQL Server alojada en </w:t>
-      </w:r>
-      <w:proofErr w:type="spellStart"/>
-      <w:r>
-        <w:rPr>
-          <w:color w:val="000000"/>
-          <w:sz w:val="24"/>
-        </w:rPr>
-        <w:t>Somee</w:t>
-      </w:r>
-      <w:proofErr w:type="spellEnd"/>
-      <w:r>
-        <w:rPr>
-          <w:color w:val="000000"/>
-          <w:sz w:val="24"/>
-        </w:rPr>
-        <w:t xml:space="preserve"> y con los servicios externos de Firebase y OSRM. Su posición central asegura que todas las peticiones al dominio se procesen de manera uniforme, controlada y bajo un único punto de aplicación de </w:t>
+        <w:t xml:space="preserve">El backend, desarrollado en Spring Boot, actúa como servidor central del sistema y concentra la lógica de negocio, la exposición de los servicios REST y el acceso a los datos (secciones 3 y 4). Es el único componente con capacidad de interactuar con la base de datos SQL Server alojada en Somee y con los servicios externos de Firebase y OSRM. Su posición central asegura que todas las peticiones al dominio se procesen de manera uniforme, controlada y bajo un único punto de aplicación de </w:t>
       </w:r>
       <w:r>
         <w:rPr>
@@ -3213,31 +3181,7 @@
     </w:p>
     <w:p>
       <w:r>
-        <w:t xml:space="preserve">El diagrama muestra a los tres clientes (Android, iOS y </w:t>
-      </w:r>
-      <w:proofErr w:type="spellStart"/>
-      <w:r>
-        <w:t>Admin</w:t>
-      </w:r>
-      <w:proofErr w:type="spellEnd"/>
-      <w:r>
-        <w:t xml:space="preserve"> Panel) conectados al API Gateway, que a su vez encamina las peticiones hacia el backend Spring Boot. El backend se comunica con la base de datos SQL Server (</w:t>
-      </w:r>
-      <w:proofErr w:type="spellStart"/>
-      <w:r>
-        <w:t>Somee</w:t>
-      </w:r>
-      <w:proofErr w:type="spellEnd"/>
-      <w:r>
-        <w:t xml:space="preserve">) para la persistencia y con los servicios externos de Firebase (autenticación y notificaciones </w:t>
-      </w:r>
-      <w:proofErr w:type="spellStart"/>
-      <w:r>
-        <w:t>push</w:t>
-      </w:r>
-      <w:proofErr w:type="spellEnd"/>
-      <w:r>
-        <w:t>) y OSRM (cálculo de rutas). Las flechas indican el sentido del flujo de las peticiones y de las respuestas.</w:t>
+        <w:t>El diagrama muestra a los tres clientes (Android, iOS y Admin Panel) conectados al API Gateway, que a su vez encamina las peticiones hacia el backend Spring Boot. El backend se comunica con la base de datos SQL Server (Somee) para la persistencia y con los servicios externos de Firebase (autenticación y notificaciones push) y OSRM (cálculo de rutas). Las flechas indican el sentido del flujo de las peticiones y de las respuestas.</w:t>
       </w:r>
     </w:p>
     <w:p>
@@ -3918,23 +3862,7 @@
           <w:color w:val="000000"/>
           <w:sz w:val="24"/>
         </w:rPr>
-        <w:t xml:space="preserve">Spring Data JPA: simplifica la capa de persistencia al proveer la infraestructura para los repositorios y el mapeo objeto-relacional. Integra la comunicación con la base de datos SQL Server de </w:t>
-      </w:r>
-      <w:proofErr w:type="spellStart"/>
-      <w:r>
-        <w:rPr>
-          <w:color w:val="000000"/>
-          <w:sz w:val="24"/>
-        </w:rPr>
-        <w:t>Somee</w:t>
-      </w:r>
-      <w:proofErr w:type="spellEnd"/>
-      <w:r>
-        <w:rPr>
-          <w:color w:val="000000"/>
-          <w:sz w:val="24"/>
-        </w:rPr>
-        <w:t xml:space="preserve"> y abstrae las operaciones CRUD sobre las entidades.</w:t>
+        <w:t>Spring Data JPA: simplifica la capa de persistencia al proveer la infraestructura para los repositorios y el mapeo objeto-relacional. Integra la comunicación con la base de datos SQL Server de Somee y abstrae las operaciones CRUD sobre las entidades.</w:t>
       </w:r>
     </w:p>
     <w:p>
@@ -3964,71 +3892,7 @@
           <w:color w:val="000000"/>
           <w:sz w:val="24"/>
         </w:rPr>
-        <w:t xml:space="preserve">Firebase </w:t>
-      </w:r>
-      <w:proofErr w:type="spellStart"/>
-      <w:r>
-        <w:rPr>
-          <w:color w:val="000000"/>
-          <w:sz w:val="24"/>
-        </w:rPr>
-        <w:t>Admin</w:t>
-      </w:r>
-      <w:proofErr w:type="spellEnd"/>
-      <w:r>
-        <w:rPr>
-          <w:color w:val="000000"/>
-          <w:sz w:val="24"/>
-        </w:rPr>
-        <w:t xml:space="preserve"> SDK: permite al backend interactuar con Firebase de manera segura en el lado servidor. Se utiliza para verificar los tokens de identidad emitidos por Firebase </w:t>
-      </w:r>
-      <w:proofErr w:type="spellStart"/>
-      <w:r>
-        <w:rPr>
-          <w:color w:val="000000"/>
-          <w:sz w:val="24"/>
-        </w:rPr>
-        <w:t>Authentication</w:t>
-      </w:r>
-      <w:proofErr w:type="spellEnd"/>
-      <w:r>
-        <w:rPr>
-          <w:color w:val="000000"/>
-          <w:sz w:val="24"/>
-        </w:rPr>
-        <w:t xml:space="preserve"> y para gestionar el envío de notificaciones </w:t>
-      </w:r>
-      <w:proofErr w:type="spellStart"/>
-      <w:r>
-        <w:rPr>
-          <w:color w:val="000000"/>
-          <w:sz w:val="24"/>
-        </w:rPr>
-        <w:t>push</w:t>
-      </w:r>
-      <w:proofErr w:type="spellEnd"/>
-      <w:r>
-        <w:rPr>
-          <w:color w:val="000000"/>
-          <w:sz w:val="24"/>
-        </w:rPr>
-        <w:t xml:space="preserve"> mediante Firebase Cloud </w:t>
-      </w:r>
-      <w:proofErr w:type="spellStart"/>
-      <w:r>
-        <w:rPr>
-          <w:color w:val="000000"/>
-          <w:sz w:val="24"/>
-        </w:rPr>
-        <w:t>Messaging</w:t>
-      </w:r>
-      <w:proofErr w:type="spellEnd"/>
-      <w:r>
-        <w:rPr>
-          <w:color w:val="000000"/>
-          <w:sz w:val="24"/>
-        </w:rPr>
-        <w:t>.</w:t>
+        <w:t>Firebase Admin SDK: permite al backend interactuar con Firebase de manera segura en el lado servidor. Se utiliza para verificar los tokens de identidad emitidos por Firebase Authentication y para gestionar el envío de notificaciones push mediante Firebase Cloud Messaging.</w:t>
       </w:r>
     </w:p>
     <w:p>
@@ -4219,39 +4083,7 @@
     </w:p>
     <w:p>
       <w:r>
-        <w:t xml:space="preserve">El diagrama muestra un bloque central que representa la aplicación Spring Boot, del cual parten conexiones hacia los módulos Spring Web, Spring Data JPA, Spring Security y Firebase </w:t>
-      </w:r>
-      <w:proofErr w:type="spellStart"/>
-      <w:r>
-        <w:t>Admin</w:t>
-      </w:r>
-      <w:proofErr w:type="spellEnd"/>
-      <w:r>
-        <w:t xml:space="preserve"> SDK. Asimismo, se representan los destinos externos: SQL Server (</w:t>
-      </w:r>
-      <w:proofErr w:type="spellStart"/>
-      <w:r>
-        <w:t>Somee</w:t>
-      </w:r>
-      <w:proofErr w:type="spellEnd"/>
-      <w:r>
-        <w:t>), Firebase (</w:t>
-      </w:r>
-      <w:proofErr w:type="spellStart"/>
-      <w:r>
-        <w:t>Authentication</w:t>
-      </w:r>
-      <w:proofErr w:type="spellEnd"/>
-      <w:r>
-        <w:t xml:space="preserve"> y Cloud </w:t>
-      </w:r>
-      <w:proofErr w:type="spellStart"/>
-      <w:r>
-        <w:t>Messaging</w:t>
-      </w:r>
-      <w:proofErr w:type="spellEnd"/>
-      <w:r>
-        <w:t>) y la API OSRM, indicando las dependencias de integración de cada módulo.</w:t>
+        <w:t>El diagrama muestra un bloque central que representa la aplicación Spring Boot, del cual parten conexiones hacia los módulos Spring Web, Spring Data JPA, Spring Security y Firebase Admin SDK. Asimismo, se representan los destinos externos: SQL Server (Somee), Firebase (Authentication y Cloud Messaging) y la API OSRM, indicando las dependencias de integración de cada módulo.</w:t>
       </w:r>
     </w:p>
     <w:p>
@@ -4338,39 +4170,7 @@
           <w:color w:val="000000"/>
           <w:sz w:val="24"/>
         </w:rPr>
-        <w:t xml:space="preserve">El frontend de Wani Connect comprende los tres clientes definidos en la sección 1: las aplicaciones móviles para Android </w:t>
-      </w:r>
-      <w:proofErr w:type="gramStart"/>
-      <w:r>
-        <w:rPr>
-          <w:color w:val="000000"/>
-          <w:sz w:val="24"/>
-        </w:rPr>
-        <w:t>e</w:t>
-      </w:r>
-      <w:proofErr w:type="gramEnd"/>
-      <w:r>
-        <w:rPr>
-          <w:color w:val="000000"/>
-          <w:sz w:val="24"/>
-        </w:rPr>
-        <w:t xml:space="preserve"> iOS y el </w:t>
-      </w:r>
-      <w:proofErr w:type="spellStart"/>
-      <w:r>
-        <w:rPr>
-          <w:color w:val="000000"/>
-          <w:sz w:val="24"/>
-        </w:rPr>
-        <w:t>Admin</w:t>
-      </w:r>
-      <w:proofErr w:type="spellEnd"/>
-      <w:r>
-        <w:rPr>
-          <w:color w:val="000000"/>
-          <w:sz w:val="24"/>
-        </w:rPr>
-        <w:t xml:space="preserve"> Panel web. Esta sección describe la organización de carpetas y módulos de estos clientes, alineada con el patrón MVE presentado en la sección 2.</w:t>
+        <w:t>El frontend de Wani Connect comprende los tres clientes definidos en la sección 1: las aplicaciones móviles para Android e iOS y el Admin Panel web. Esta sección describe la organización de carpetas y módulos de estos clientes, alineada con el patrón MVE presentado en la sección 2.</w:t>
       </w:r>
     </w:p>
     <w:p>
@@ -4429,61 +4229,27 @@
           <w:sz w:val="24"/>
         </w:rPr>
       </w:pPr>
-      <w:proofErr w:type="spellStart"/>
-      <w:r>
-        <w:rPr>
-          <w:color w:val="000000"/>
-          <w:sz w:val="24"/>
-        </w:rPr>
-        <w:t>screens</w:t>
-      </w:r>
-      <w:proofErr w:type="spellEnd"/>
-      <w:r>
-        <w:rPr>
-          <w:color w:val="000000"/>
-          <w:sz w:val="24"/>
-        </w:rPr>
-        <w:t xml:space="preserve"> o </w:t>
-      </w:r>
-      <w:proofErr w:type="spellStart"/>
-      <w:r>
-        <w:rPr>
-          <w:color w:val="000000"/>
-          <w:sz w:val="24"/>
-        </w:rPr>
-        <w:t>pages</w:t>
-      </w:r>
-      <w:proofErr w:type="spellEnd"/>
-      <w:r>
-        <w:rPr>
-          <w:color w:val="000000"/>
-          <w:sz w:val="24"/>
-        </w:rPr>
-        <w:t>: contiene las pantallas de la aplicación, que implementan la capa de vista del patrón MVE (sección 2). Su contenido incluye la interfaz visual de cada funcionalidad y su navegación correspondiente (sección 6).</w:t>
-      </w:r>
-    </w:p>
-    <w:p>
-      <w:pPr>
-        <w:rPr>
-          <w:color w:val="000000"/>
-          <w:sz w:val="24"/>
-        </w:rPr>
-      </w:pPr>
-      <w:proofErr w:type="spellStart"/>
-      <w:r>
-        <w:rPr>
-          <w:color w:val="000000"/>
-          <w:sz w:val="24"/>
-        </w:rPr>
-        <w:t>components</w:t>
-      </w:r>
-      <w:proofErr w:type="spellEnd"/>
-      <w:r>
-        <w:rPr>
-          <w:color w:val="000000"/>
-          <w:sz w:val="24"/>
-        </w:rPr>
-        <w:t>: reúne los componentes reutilizables de interfaz de usuario que se emplean en múltiples pantallas, como encabezados, tarjetas, botones y elementos de formulario.</w:t>
+      <w:r>
+        <w:rPr>
+          <w:color w:val="000000"/>
+          <w:sz w:val="24"/>
+        </w:rPr>
+        <w:t>screens o pages: contiene las pantallas de la aplicación, que implementan la capa de vista del patrón MVE (sección 2). Su contenido incluye la interfaz visual de cada funcionalidad y su navegación correspondiente (sección 6).</w:t>
+      </w:r>
+    </w:p>
+    <w:p>
+      <w:pPr>
+        <w:rPr>
+          <w:color w:val="000000"/>
+          <w:sz w:val="24"/>
+        </w:rPr>
+      </w:pPr>
+      <w:r>
+        <w:rPr>
+          <w:color w:val="000000"/>
+          <w:sz w:val="24"/>
+        </w:rPr>
+        <w:t>components: reúne los componentes reutilizables de interfaz de usuario que se emplean en múltiples pantallas, como encabezados, tarjetas, botones y elementos de formulario.</w:t>
       </w:r>
     </w:p>
     <w:p>
@@ -4522,117 +4288,42 @@
           <w:sz w:val="24"/>
         </w:rPr>
       </w:pPr>
-      <w:proofErr w:type="spellStart"/>
-      <w:r>
-        <w:rPr>
-          <w:color w:val="000000"/>
-          <w:sz w:val="24"/>
-        </w:rPr>
-        <w:t>contexts</w:t>
-      </w:r>
-      <w:proofErr w:type="spellEnd"/>
-      <w:r>
-        <w:rPr>
-          <w:color w:val="000000"/>
-          <w:sz w:val="24"/>
-        </w:rPr>
-        <w:t xml:space="preserve"> o </w:t>
-      </w:r>
-      <w:proofErr w:type="spellStart"/>
-      <w:r>
-        <w:rPr>
-          <w:color w:val="000000"/>
-          <w:sz w:val="24"/>
-        </w:rPr>
-        <w:t>state</w:t>
-      </w:r>
-      <w:proofErr w:type="spellEnd"/>
-      <w:r>
-        <w:rPr>
-          <w:color w:val="000000"/>
-          <w:sz w:val="24"/>
-        </w:rPr>
-        <w:t xml:space="preserve">: aloja los contextos de estado global (Auth, Lang y </w:t>
-      </w:r>
-      <w:proofErr w:type="spellStart"/>
-      <w:r>
-        <w:rPr>
-          <w:color w:val="000000"/>
-          <w:sz w:val="24"/>
-        </w:rPr>
-        <w:t>Theme</w:t>
-      </w:r>
-      <w:proofErr w:type="spellEnd"/>
-      <w:r>
-        <w:rPr>
-          <w:color w:val="000000"/>
-          <w:sz w:val="24"/>
-        </w:rPr>
-        <w:t>) descritos en la sección 8.</w:t>
-      </w:r>
-    </w:p>
-    <w:p>
-      <w:pPr>
-        <w:rPr>
-          <w:color w:val="000000"/>
-          <w:sz w:val="24"/>
-        </w:rPr>
-      </w:pPr>
-      <w:proofErr w:type="spellStart"/>
-      <w:r>
-        <w:rPr>
-          <w:color w:val="000000"/>
-          <w:sz w:val="24"/>
-        </w:rPr>
-        <w:t>navigation</w:t>
-      </w:r>
-      <w:proofErr w:type="spellEnd"/>
-      <w:r>
-        <w:rPr>
-          <w:color w:val="000000"/>
-          <w:sz w:val="24"/>
-        </w:rPr>
-        <w:t>: define la configuración de la navegación entre pantallas, detallada en la sección 6.</w:t>
-      </w:r>
-    </w:p>
-    <w:p>
-      <w:pPr>
-        <w:rPr>
-          <w:color w:val="000000"/>
-          <w:sz w:val="24"/>
-        </w:rPr>
-      </w:pPr>
-      <w:proofErr w:type="spellStart"/>
-      <w:r>
-        <w:rPr>
-          <w:color w:val="000000"/>
-          <w:sz w:val="24"/>
-        </w:rPr>
-        <w:t>assets</w:t>
-      </w:r>
-      <w:proofErr w:type="spellEnd"/>
-      <w:r>
-        <w:rPr>
-          <w:color w:val="000000"/>
-          <w:sz w:val="24"/>
-        </w:rPr>
-        <w:t xml:space="preserve"> o </w:t>
-      </w:r>
-      <w:proofErr w:type="spellStart"/>
-      <w:r>
-        <w:rPr>
-          <w:color w:val="000000"/>
-          <w:sz w:val="24"/>
-        </w:rPr>
-        <w:t>resources</w:t>
-      </w:r>
-      <w:proofErr w:type="spellEnd"/>
-      <w:r>
-        <w:rPr>
-          <w:color w:val="000000"/>
-          <w:sz w:val="24"/>
-        </w:rPr>
-        <w:t>: contiene los recursos estáticos, como imágenes, iconos y traducciones utilizadas por el contexto de idioma.</w:t>
+      <w:r>
+        <w:rPr>
+          <w:color w:val="000000"/>
+          <w:sz w:val="24"/>
+        </w:rPr>
+        <w:t>contexts o state: aloja los contextos de estado global (Auth, Lang y Theme) descritos en la sección 8.</w:t>
+      </w:r>
+    </w:p>
+    <w:p>
+      <w:pPr>
+        <w:rPr>
+          <w:color w:val="000000"/>
+          <w:sz w:val="24"/>
+        </w:rPr>
+      </w:pPr>
+      <w:r>
+        <w:rPr>
+          <w:color w:val="000000"/>
+          <w:sz w:val="24"/>
+        </w:rPr>
+        <w:t>navigation: define la configuración de la navegación entre pantallas, detallada en la sección 6.</w:t>
+      </w:r>
+    </w:p>
+    <w:p>
+      <w:pPr>
+        <w:rPr>
+          <w:color w:val="000000"/>
+          <w:sz w:val="24"/>
+        </w:rPr>
+      </w:pPr>
+      <w:r>
+        <w:rPr>
+          <w:color w:val="000000"/>
+          <w:sz w:val="24"/>
+        </w:rPr>
+        <w:t>assets o resources: contiene los recursos estáticos, como imágenes, iconos y traducciones utilizadas por el contexto de idioma.</w:t>
       </w:r>
     </w:p>
     <w:p>
@@ -4666,72 +4357,22 @@
           <w:color w:val="000000"/>
           <w:sz w:val="24"/>
         </w:rPr>
-        <w:t xml:space="preserve">. Organización del </w:t>
-      </w:r>
-      <w:proofErr w:type="spellStart"/>
-      <w:r>
-        <w:rPr>
-          <w:b/>
-          <w:color w:val="000000"/>
-          <w:sz w:val="24"/>
-        </w:rPr>
-        <w:t>Admin</w:t>
-      </w:r>
-      <w:proofErr w:type="spellEnd"/>
-      <w:r>
-        <w:rPr>
-          <w:b/>
-          <w:color w:val="000000"/>
-          <w:sz w:val="24"/>
-        </w:rPr>
-        <w:t xml:space="preserve"> Panel</w:t>
-      </w:r>
-    </w:p>
-    <w:p>
-      <w:pPr>
-        <w:rPr>
-          <w:color w:val="000000"/>
-          <w:sz w:val="24"/>
-        </w:rPr>
-      </w:pPr>
-      <w:r>
-        <w:rPr>
-          <w:color w:val="000000"/>
-          <w:sz w:val="24"/>
-        </w:rPr>
-        <w:t xml:space="preserve">El </w:t>
-      </w:r>
-      <w:proofErr w:type="spellStart"/>
-      <w:r>
-        <w:rPr>
-          <w:color w:val="000000"/>
-          <w:sz w:val="24"/>
-        </w:rPr>
-        <w:t>Admin</w:t>
-      </w:r>
-      <w:proofErr w:type="spellEnd"/>
-      <w:r>
-        <w:rPr>
-          <w:color w:val="000000"/>
-          <w:sz w:val="24"/>
-        </w:rPr>
-        <w:t xml:space="preserve"> Panel, al ser un cliente web, comparte con los clientes móviles la estructura de módulos de presentación y de servicios, pero se diferencia al incorporar vistas propias del rol administrativo, como la gestión de eventos, emprendimientos y usuarios. La carpeta de pantallas del </w:t>
-      </w:r>
-      <w:proofErr w:type="spellStart"/>
-      <w:r>
-        <w:rPr>
-          <w:color w:val="000000"/>
-          <w:sz w:val="24"/>
-        </w:rPr>
-        <w:t>Admin</w:t>
-      </w:r>
-      <w:proofErr w:type="spellEnd"/>
-      <w:r>
-        <w:rPr>
-          <w:color w:val="000000"/>
-          <w:sz w:val="24"/>
-        </w:rPr>
-        <w:t xml:space="preserve"> Panel agrupa estas vistas administrativas, mientras que las carpetas de componentes, servicios y contextos se mantienen bajo la misma filosofía de separación definida para los clientes móviles, lo que favorece la consistencia arquitectónica en todo el frontend.</w:t>
+        <w:t>. Organización del Admin Panel</w:t>
+      </w:r>
+    </w:p>
+    <w:p>
+      <w:pPr>
+        <w:rPr>
+          <w:color w:val="000000"/>
+          <w:sz w:val="24"/>
+        </w:rPr>
+      </w:pPr>
+      <w:r>
+        <w:rPr>
+          <w:color w:val="000000"/>
+          <w:sz w:val="24"/>
+        </w:rPr>
+        <w:t>El Admin Panel, al ser un cliente web, comparte con los clientes móviles la estructura de módulos de presentación y de servicios, pero se diferencia al incorporar vistas propias del rol administrativo, como la gestión de eventos, emprendimientos y usuarios. La carpeta de pantallas del Admin Panel agrupa estas vistas administrativas, mientras que las carpetas de componentes, servicios y contextos se mantienen bajo la misma filosofía de separación definida para los clientes móviles, lo que favorece la consistencia arquitectónica en todo el frontend.</w:t>
       </w:r>
     </w:p>
     <w:p>
@@ -4906,119 +4547,7 @@
           <w:color w:val="000000"/>
           <w:sz w:val="24"/>
         </w:rPr>
-        <w:t xml:space="preserve">El diagrama presenta un directorio raíz común del que parten las carpetas </w:t>
-      </w:r>
-      <w:proofErr w:type="spellStart"/>
-      <w:r>
-        <w:rPr>
-          <w:color w:val="000000"/>
-          <w:sz w:val="24"/>
-        </w:rPr>
-        <w:t>screens</w:t>
-      </w:r>
-      <w:proofErr w:type="spellEnd"/>
-      <w:r>
-        <w:rPr>
-          <w:color w:val="000000"/>
-          <w:sz w:val="24"/>
-        </w:rPr>
-        <w:t xml:space="preserve">, </w:t>
-      </w:r>
-      <w:proofErr w:type="spellStart"/>
-      <w:r>
-        <w:rPr>
-          <w:color w:val="000000"/>
-          <w:sz w:val="24"/>
-        </w:rPr>
-        <w:t>components</w:t>
-      </w:r>
-      <w:proofErr w:type="spellEnd"/>
-      <w:r>
-        <w:rPr>
-          <w:color w:val="000000"/>
-          <w:sz w:val="24"/>
-        </w:rPr>
-        <w:t xml:space="preserve">, services, </w:t>
-      </w:r>
-      <w:proofErr w:type="spellStart"/>
-      <w:r>
-        <w:rPr>
-          <w:color w:val="000000"/>
-          <w:sz w:val="24"/>
-        </w:rPr>
-        <w:t>contexts</w:t>
-      </w:r>
-      <w:proofErr w:type="spellEnd"/>
-      <w:r>
-        <w:rPr>
-          <w:color w:val="000000"/>
-          <w:sz w:val="24"/>
-        </w:rPr>
-        <w:t xml:space="preserve">, </w:t>
-      </w:r>
-      <w:proofErr w:type="spellStart"/>
-      <w:r>
-        <w:rPr>
-          <w:color w:val="000000"/>
-          <w:sz w:val="24"/>
-        </w:rPr>
-        <w:t>navigation</w:t>
-      </w:r>
-      <w:proofErr w:type="spellEnd"/>
-      <w:r>
-        <w:rPr>
-          <w:color w:val="000000"/>
-          <w:sz w:val="24"/>
-        </w:rPr>
-        <w:t xml:space="preserve"> y </w:t>
-      </w:r>
-      <w:proofErr w:type="spellStart"/>
-      <w:r>
-        <w:rPr>
-          <w:color w:val="000000"/>
-          <w:sz w:val="24"/>
-        </w:rPr>
-        <w:t>assets</w:t>
-      </w:r>
-      <w:proofErr w:type="spellEnd"/>
-      <w:r>
-        <w:rPr>
-          <w:color w:val="000000"/>
-          <w:sz w:val="24"/>
-        </w:rPr>
-        <w:t xml:space="preserve">. Se muestran una variante para el cliente móvil y otra para el </w:t>
-      </w:r>
-      <w:proofErr w:type="spellStart"/>
-      <w:r>
-        <w:rPr>
-          <w:color w:val="000000"/>
-          <w:sz w:val="24"/>
-        </w:rPr>
-        <w:t>Admin</w:t>
-      </w:r>
-      <w:proofErr w:type="spellEnd"/>
-      <w:r>
-        <w:rPr>
-          <w:color w:val="000000"/>
-          <w:sz w:val="24"/>
-        </w:rPr>
-        <w:t xml:space="preserve"> Panel, indicando en ambas el mismo conjunto de carpetas, con la diferencia de que el </w:t>
-      </w:r>
-      <w:proofErr w:type="spellStart"/>
-      <w:r>
-        <w:rPr>
-          <w:color w:val="000000"/>
-          <w:sz w:val="24"/>
-        </w:rPr>
-        <w:t>Admin</w:t>
-      </w:r>
-      <w:proofErr w:type="spellEnd"/>
-      <w:r>
-        <w:rPr>
-          <w:color w:val="000000"/>
-          <w:sz w:val="24"/>
-        </w:rPr>
-        <w:t xml:space="preserve"> Panel enfatiza las pantallas de administración.</w:t>
+        <w:t>El diagrama presenta un directorio raíz común del que parten las carpetas screens, components, services, contexts, navigation y assets. Se muestran una variante para el cliente móvil y otra para el Admin Panel, indicando en ambas el mismo conjunto de carpetas, con la diferencia de que el Admin Panel enfatiza las pantallas de administración.</w:t>
       </w:r>
     </w:p>
     <w:p>
@@ -5066,23 +4595,7 @@
           <w:color w:val="000000"/>
           <w:sz w:val="24"/>
         </w:rPr>
-        <w:t xml:space="preserve">La navegación define cómo el usuario se desplaza entre las pantallas de la aplicación. Wani Connect organiza la navegación en dos estructuras complementarias: un Auth Stack, que gestiona las pantallas previas a la autenticación, y un Tab </w:t>
-      </w:r>
-      <w:proofErr w:type="spellStart"/>
-      <w:r>
-        <w:rPr>
-          <w:color w:val="000000"/>
-          <w:sz w:val="24"/>
-        </w:rPr>
-        <w:t>Navigator</w:t>
-      </w:r>
-      <w:proofErr w:type="spellEnd"/>
-      <w:r>
-        <w:rPr>
-          <w:color w:val="000000"/>
-          <w:sz w:val="24"/>
-        </w:rPr>
-        <w:t>, que organiza las pantallas principales tras la sesión iniciada. Esta sección describe ambas estructuras y el flujo entre pantallas.</w:t>
+        <w:t>La navegación define cómo el usuario se desplaza entre las pantallas de la aplicación. Wani Connect organiza la navegación en dos estructuras complementarias: un Auth Stack, que gestiona las pantallas previas a la autenticación, y un Tab Navigator, que organiza las pantallas principales tras la sesión iniciada. Esta sección describe ambas estructuras y el flujo entre pantallas.</w:t>
       </w:r>
     </w:p>
     <w:p>
@@ -5131,39 +4644,7 @@
           <w:color w:val="000000"/>
           <w:sz w:val="24"/>
         </w:rPr>
-        <w:t xml:space="preserve">El Auth Stack agrupa las pantallas relacionadas con el acceso al sistema. Incluye la pantalla de inicio de sesión (Login), la pantalla de registro (Register) y la pantalla de verificación en dos pasos (Two-Factor </w:t>
-      </w:r>
-      <w:proofErr w:type="spellStart"/>
-      <w:r>
-        <w:rPr>
-          <w:color w:val="000000"/>
-          <w:sz w:val="24"/>
-        </w:rPr>
-        <w:t>Verification</w:t>
-      </w:r>
-      <w:proofErr w:type="spellEnd"/>
-      <w:r>
-        <w:rPr>
-          <w:color w:val="000000"/>
-          <w:sz w:val="24"/>
-        </w:rPr>
-        <w:t>). Esta pila es la primera que se presenta al usuario y controla la transición hacia las pantallas principales una vez que la autenticación se completa satisfactoriamente (sección 7). Su carácter de pila (</w:t>
-      </w:r>
-      <w:proofErr w:type="spellStart"/>
-      <w:r>
-        <w:rPr>
-          <w:color w:val="000000"/>
-          <w:sz w:val="24"/>
-        </w:rPr>
-        <w:t>stack</w:t>
-      </w:r>
-      <w:proofErr w:type="spellEnd"/>
-      <w:r>
-        <w:rPr>
-          <w:color w:val="000000"/>
-          <w:sz w:val="24"/>
-        </w:rPr>
-        <w:t>) implica que las pantallas se apilan y se puede regresar a la anterior mediante la acción de retroceso.</w:t>
+        <w:t>El Auth Stack agrupa las pantallas relacionadas con el acceso al sistema. Incluye la pantalla de inicio de sesión (Login), la pantalla de registro (Register) y la pantalla de verificación en dos pasos (Two-Factor Verification). Esta pila es la primera que se presenta al usuario y controla la transición hacia las pantallas principales una vez que la autenticación se completa satisfactoriamente (sección 7). Su carácter de pila (stack) implica que las pantallas se apilan y se puede regresar a la anterior mediante la acción de retroceso.</w:t>
       </w:r>
     </w:p>
     <w:p>
@@ -5197,146 +4678,48 @@
           <w:color w:val="000000"/>
           <w:sz w:val="24"/>
         </w:rPr>
-        <w:t xml:space="preserve">. Tab </w:t>
-      </w:r>
-      <w:proofErr w:type="spellStart"/>
-      <w:r>
+        <w:t>. Tab Navigator</w:t>
+      </w:r>
+    </w:p>
+    <w:p>
+      <w:pPr>
+        <w:rPr>
+          <w:color w:val="000000"/>
+          <w:sz w:val="24"/>
+        </w:rPr>
+      </w:pPr>
+      <w:r>
+        <w:rPr>
+          <w:color w:val="000000"/>
+          <w:sz w:val="24"/>
+        </w:rPr>
+        <w:t>Una vez autenticado, el usuario accede al Tab Navigator, que organiza las funcionalidades principales en pestañas de acceso rápido. Las pestañas son: Home (inicio), Map (mapa), Events (eventos), Profile (perfil), Community (comunidad) y Notifications (notificaciones). Cada pestaña agrupa una o varias pantallas relacionadas, y el usuario puede alternar entre ellas de manera directa y persistente sin perder su posición dentro de cada sección. Este tipo de navegación resulta adecuado para funcionalidades de uso frecuente e independiente entre sí.</w:t>
+      </w:r>
+    </w:p>
+    <w:p>
+      <w:pPr>
+        <w:spacing w:after="60"/>
         <w:rPr>
           <w:b/>
           <w:color w:val="000000"/>
           <w:sz w:val="24"/>
         </w:rPr>
-        <w:t>Navigator</w:t>
-      </w:r>
-      <w:proofErr w:type="spellEnd"/>
-    </w:p>
-    <w:p>
-      <w:pPr>
-        <w:rPr>
-          <w:color w:val="000000"/>
-          <w:sz w:val="24"/>
-        </w:rPr>
-      </w:pPr>
-      <w:r>
-        <w:rPr>
-          <w:color w:val="000000"/>
-          <w:sz w:val="24"/>
-        </w:rPr>
-        <w:t xml:space="preserve">Una vez autenticado, el usuario accede al Tab </w:t>
-      </w:r>
-      <w:proofErr w:type="spellStart"/>
-      <w:r>
-        <w:rPr>
-          <w:color w:val="000000"/>
-          <w:sz w:val="24"/>
-        </w:rPr>
-        <w:t>Navigator</w:t>
-      </w:r>
-      <w:proofErr w:type="spellEnd"/>
-      <w:r>
-        <w:rPr>
-          <w:color w:val="000000"/>
-          <w:sz w:val="24"/>
-        </w:rPr>
-        <w:t xml:space="preserve">, que organiza las funcionalidades principales en pestañas de acceso rápido. Las pestañas son: Home (inicio), </w:t>
-      </w:r>
-      <w:proofErr w:type="spellStart"/>
-      <w:r>
-        <w:rPr>
-          <w:color w:val="000000"/>
-          <w:sz w:val="24"/>
-        </w:rPr>
-        <w:t>Map</w:t>
-      </w:r>
-      <w:proofErr w:type="spellEnd"/>
-      <w:r>
-        <w:rPr>
-          <w:color w:val="000000"/>
-          <w:sz w:val="24"/>
-        </w:rPr>
-        <w:t xml:space="preserve"> (mapa), </w:t>
-      </w:r>
-      <w:proofErr w:type="spellStart"/>
-      <w:r>
-        <w:rPr>
-          <w:color w:val="000000"/>
-          <w:sz w:val="24"/>
-        </w:rPr>
-        <w:t>Events</w:t>
-      </w:r>
-      <w:proofErr w:type="spellEnd"/>
-      <w:r>
-        <w:rPr>
-          <w:color w:val="000000"/>
-          <w:sz w:val="24"/>
-        </w:rPr>
-        <w:t xml:space="preserve"> (eventos), </w:t>
-      </w:r>
-      <w:proofErr w:type="spellStart"/>
-      <w:r>
-        <w:rPr>
-          <w:color w:val="000000"/>
-          <w:sz w:val="24"/>
-        </w:rPr>
-        <w:t>Profile</w:t>
-      </w:r>
-      <w:proofErr w:type="spellEnd"/>
-      <w:r>
-        <w:rPr>
-          <w:color w:val="000000"/>
-          <w:sz w:val="24"/>
-        </w:rPr>
-        <w:t xml:space="preserve"> (perfil), </w:t>
-      </w:r>
-      <w:proofErr w:type="spellStart"/>
-      <w:r>
-        <w:rPr>
-          <w:color w:val="000000"/>
-          <w:sz w:val="24"/>
-        </w:rPr>
-        <w:t>Community</w:t>
-      </w:r>
-      <w:proofErr w:type="spellEnd"/>
-      <w:r>
-        <w:rPr>
-          <w:color w:val="000000"/>
-          <w:sz w:val="24"/>
-        </w:rPr>
-        <w:t xml:space="preserve"> (comunidad) y </w:t>
-      </w:r>
-      <w:proofErr w:type="spellStart"/>
-      <w:r>
-        <w:rPr>
-          <w:color w:val="000000"/>
-          <w:sz w:val="24"/>
-        </w:rPr>
-        <w:t>Notifications</w:t>
-      </w:r>
-      <w:proofErr w:type="spellEnd"/>
-      <w:r>
-        <w:rPr>
-          <w:color w:val="000000"/>
-          <w:sz w:val="24"/>
-        </w:rPr>
-        <w:t xml:space="preserve"> (notificaciones). Cada pestaña agrupa una o varias pantallas relacionadas, y el usuario puede alternar entre ellas de manera directa y persistente sin perder su posición dentro de cada sección. Este tipo de navegación resulta adecuado para funcionalidades de uso frecuente e independiente entre sí.</w:t>
-      </w:r>
-    </w:p>
-    <w:p>
-      <w:pPr>
-        <w:spacing w:after="60"/>
+      </w:pPr>
+      <w:r>
         <w:rPr>
           <w:b/>
           <w:color w:val="000000"/>
           <w:sz w:val="24"/>
         </w:rPr>
-      </w:pPr>
+        <w:t>6.</w:t>
+      </w:r>
       <w:r>
         <w:rPr>
           <w:b/>
           <w:color w:val="000000"/>
           <w:sz w:val="24"/>
         </w:rPr>
-        <w:t>6.</w:t>
+        <w:t>3</w:t>
       </w:r>
       <w:r>
         <w:rPr>
@@ -5344,14 +4727,6 @@
           <w:color w:val="000000"/>
           <w:sz w:val="24"/>
         </w:rPr>
-        <w:t>3</w:t>
-      </w:r>
-      <w:r>
-        <w:rPr>
-          <w:b/>
-          <w:color w:val="000000"/>
-          <w:sz w:val="24"/>
-        </w:rPr>
         <w:t>. Flujo entre pantallas</w:t>
       </w:r>
     </w:p>
@@ -5367,39 +4742,7 @@
           <w:color w:val="000000"/>
           <w:sz w:val="24"/>
         </w:rPr>
-        <w:t xml:space="preserve">El flujo de navegación es el siguiente: al abrir la aplicación, el usuario se encuentra con el Auth Stack. Si ya dispone de una sesión válida almacenada (sección 7), se redirige directamente al Tab </w:t>
-      </w:r>
-      <w:proofErr w:type="spellStart"/>
-      <w:r>
-        <w:rPr>
-          <w:color w:val="000000"/>
-          <w:sz w:val="24"/>
-        </w:rPr>
-        <w:t>Navigator</w:t>
-      </w:r>
-      <w:proofErr w:type="spellEnd"/>
-      <w:r>
-        <w:rPr>
-          <w:color w:val="000000"/>
-          <w:sz w:val="24"/>
-        </w:rPr>
-        <w:t xml:space="preserve">; en caso contrario, debe iniciar sesión o registrarse y completar la verificación en dos pasos. Al lograrlo, el Auth Stack se sustituye por el Tab </w:t>
-      </w:r>
-      <w:proofErr w:type="spellStart"/>
-      <w:r>
-        <w:rPr>
-          <w:color w:val="000000"/>
-          <w:sz w:val="24"/>
-        </w:rPr>
-        <w:t>Navigator</w:t>
-      </w:r>
-      <w:proofErr w:type="spellEnd"/>
-      <w:r>
-        <w:rPr>
-          <w:color w:val="000000"/>
-          <w:sz w:val="24"/>
-        </w:rPr>
-        <w:t>, desde el cual el usuario accede a las distintas pestañas. El cierre de sesión o la invalidación del token devuelve al usuario al Auth Stack.</w:t>
+        <w:t>El flujo de navegación es el siguiente: al abrir la aplicación, el usuario se encuentra con el Auth Stack. Si ya dispone de una sesión válida almacenada (sección 7), se redirige directamente al Tab Navigator; en caso contrario, debe iniciar sesión o registrarse y completar la verificación en dos pasos. Al lograrlo, el Auth Stack se sustituye por el Tab Navigator, desde el cual el usuario accede a las distintas pestañas. El cierre de sesión o la invalidación del token devuelve al usuario al Auth Stack.</w:t>
       </w:r>
     </w:p>
     <w:p>
@@ -5609,39 +4952,7 @@
           <w:color w:val="000000"/>
           <w:sz w:val="24"/>
         </w:rPr>
-        <w:t xml:space="preserve">La autenticación es el mecanismo mediante el cual el sistema verifica la identidad del usuario y establece una sesión segura. Wani Connect combina el inicio de sesión con Google a través de Firebase </w:t>
-      </w:r>
-      <w:proofErr w:type="spellStart"/>
-      <w:r>
-        <w:rPr>
-          <w:color w:val="000000"/>
-          <w:sz w:val="24"/>
-        </w:rPr>
-        <w:t>Authentication</w:t>
-      </w:r>
-      <w:proofErr w:type="spellEnd"/>
-      <w:r>
-        <w:rPr>
-          <w:color w:val="000000"/>
-          <w:sz w:val="24"/>
-        </w:rPr>
-        <w:t xml:space="preserve">, la verificación de tokens en el backend mediante Firebase </w:t>
-      </w:r>
-      <w:proofErr w:type="spellStart"/>
-      <w:r>
-        <w:rPr>
-          <w:color w:val="000000"/>
-          <w:sz w:val="24"/>
-        </w:rPr>
-        <w:t>Admin</w:t>
-      </w:r>
-      <w:proofErr w:type="spellEnd"/>
-      <w:r>
-        <w:rPr>
-          <w:color w:val="000000"/>
-          <w:sz w:val="24"/>
-        </w:rPr>
-        <w:t xml:space="preserve"> SDK, la generación de un JWT propio y el refuerzo de la seguridad con autenticación de dos factores (2FA) basada en TOTP. Esta sección describe el flujo completo.</w:t>
+        <w:t>La autenticación es el mecanismo mediante el cual el sistema verifica la identidad del usuario y establece una sesión segura. Wani Connect combina el inicio de sesión con Google a través de Firebase Authentication, la verificación de tokens en el backend mediante Firebase Admin SDK, la generación de un JWT propio y el refuerzo de la seguridad con autenticación de dos factores (2FA) basada en TOTP. Esta sección describe el flujo completo.</w:t>
       </w:r>
     </w:p>
     <w:p>
@@ -5672,39 +4983,7 @@
           <w:color w:val="000000"/>
           <w:sz w:val="24"/>
         </w:rPr>
-        <w:t xml:space="preserve">En la pantalla de inicio de sesión, el usuario elige la opción de acceder con su cuenta de Google. El SDK de Firebase </w:t>
-      </w:r>
-      <w:proofErr w:type="spellStart"/>
-      <w:r>
-        <w:rPr>
-          <w:color w:val="000000"/>
-          <w:sz w:val="24"/>
-        </w:rPr>
-        <w:t>Authentication</w:t>
-      </w:r>
-      <w:proofErr w:type="spellEnd"/>
-      <w:r>
-        <w:rPr>
-          <w:color w:val="000000"/>
-          <w:sz w:val="24"/>
-        </w:rPr>
-        <w:t xml:space="preserve">, integrado en el cliente, gestiona el flujo OAuth y devuelve un </w:t>
-      </w:r>
-      <w:proofErr w:type="spellStart"/>
-      <w:r>
-        <w:rPr>
-          <w:color w:val="000000"/>
-          <w:sz w:val="24"/>
-        </w:rPr>
-        <w:t>idToken</w:t>
-      </w:r>
-      <w:proofErr w:type="spellEnd"/>
-      <w:r>
-        <w:rPr>
-          <w:color w:val="000000"/>
-          <w:sz w:val="24"/>
-        </w:rPr>
-        <w:t xml:space="preserve"> de Google al finalizar. Este token de identidad es la credencial que el cliente remitirá al backend para iniciar la verificación.</w:t>
+        <w:t>En la pantalla de inicio de sesión, el usuario elige la opción de acceder con su cuenta de Google. El SDK de Firebase Authentication, integrado en el cliente, gestiona el flujo OAuth y devuelve un idToken de Google al finalizar. Este token de identidad es la credencial que el cliente remitirá al backend para iniciar la verificación.</w:t>
       </w:r>
     </w:p>
     <w:p>
@@ -5719,23 +4998,7 @@
         <w:t>2</w:t>
       </w:r>
       <w:r>
-        <w:t xml:space="preserve">. Verificación del </w:t>
-      </w:r>
-      <w:proofErr w:type="spellStart"/>
-      <w:r>
-        <w:t>idToken</w:t>
-      </w:r>
-      <w:proofErr w:type="spellEnd"/>
-      <w:r>
-        <w:t xml:space="preserve"> con Firebase </w:t>
-      </w:r>
-      <w:proofErr w:type="spellStart"/>
-      <w:r>
-        <w:t>Admin</w:t>
-      </w:r>
-      <w:proofErr w:type="spellEnd"/>
-      <w:r>
-        <w:t xml:space="preserve"> SDK</w:t>
+        <w:t>. Verificación del idToken con Firebase Admin SDK</w:t>
       </w:r>
       <w:bookmarkEnd w:id="17"/>
     </w:p>
@@ -5751,39 +5014,7 @@
           <w:color w:val="000000"/>
           <w:sz w:val="24"/>
         </w:rPr>
-        <w:t xml:space="preserve">El backend recibe el </w:t>
-      </w:r>
-      <w:proofErr w:type="spellStart"/>
-      <w:r>
-        <w:rPr>
-          <w:color w:val="000000"/>
-          <w:sz w:val="24"/>
-        </w:rPr>
-        <w:t>idToken</w:t>
-      </w:r>
-      <w:proofErr w:type="spellEnd"/>
-      <w:r>
-        <w:rPr>
-          <w:color w:val="000000"/>
-          <w:sz w:val="24"/>
-        </w:rPr>
-        <w:t xml:space="preserve"> de Google y lo valida mediante el Firebase </w:t>
-      </w:r>
-      <w:proofErr w:type="spellStart"/>
-      <w:r>
-        <w:rPr>
-          <w:color w:val="000000"/>
-          <w:sz w:val="24"/>
-        </w:rPr>
-        <w:t>Admin</w:t>
-      </w:r>
-      <w:proofErr w:type="spellEnd"/>
-      <w:r>
-        <w:rPr>
-          <w:color w:val="000000"/>
-          <w:sz w:val="24"/>
-        </w:rPr>
-        <w:t xml:space="preserve"> SDK (sección 4.3). Esta verificación confirma que el token es auténtico, no ha expirado y ha sido emitido para el proyecto de Firebase del sistema. De esta validación se deriva la identidad del usuario (por ejemplo, su identificador) de forma confiable, sin almacenar contraseñas en el sistema. [Se asume que el identificador único de usuario proviene del UID de Firebase; el autor debe confirmar el atributo empleado para correlacionar con el usuario del sistema].</w:t>
+        <w:t>El backend recibe el idToken de Google y lo valida mediante el Firebase Admin SDK (sección 4.3). Esta verificación confirma que el token es auténtico, no ha expirado y ha sido emitido para el proyecto de Firebase del sistema. De esta validación se deriva la identidad del usuario (por ejemplo, su identificador) de forma confiable, sin almacenar contraseñas en el sistema. [Se asume que el identificador único de usuario proviene del UID de Firebase; el autor debe confirmar el atributo empleado para correlacionar con el usuario del sistema].</w:t>
       </w:r>
     </w:p>
     <w:p>
@@ -5814,23 +5045,7 @@
           <w:color w:val="000000"/>
           <w:sz w:val="24"/>
         </w:rPr>
-        <w:t xml:space="preserve">Tras la verificación, el backend genera un token JWT propio con los datos de identidad y los permisos del usuario, firmado con un secreto del servidor. Este JWT es el mecanismo de autorización de las peticiones subsiguientes: cada petición protegida lo incluye y es validado por el paquete security (secciones 3.2 y 4.3), evitando revalidar el </w:t>
-      </w:r>
-      <w:proofErr w:type="spellStart"/>
-      <w:r>
-        <w:rPr>
-          <w:color w:val="000000"/>
-          <w:sz w:val="24"/>
-        </w:rPr>
-        <w:t>idToken</w:t>
-      </w:r>
-      <w:proofErr w:type="spellEnd"/>
-      <w:r>
-        <w:rPr>
-          <w:color w:val="000000"/>
-          <w:sz w:val="24"/>
-        </w:rPr>
-        <w:t xml:space="preserve"> de Google en cada llamada y reduciendo así la latencia y la dependencia del servicio externo.</w:t>
+        <w:t>Tras la verificación, el backend genera un token JWT propio con los datos de identidad y los permisos del usuario, firmado con un secreto del servidor. Este JWT es el mecanismo de autorización de las peticiones subsiguientes: cada petición protegida lo incluye y es validado por el paquete security (secciones 3.2 y 4.3), evitando revalidar el idToken de Google en cada llamada y reduciendo así la latencia y la dependencia del servicio externo.</w:t>
       </w:r>
     </w:p>
     <w:p>
@@ -5878,55 +5093,7 @@
           <w:color w:val="000000"/>
           <w:sz w:val="24"/>
         </w:rPr>
-        <w:t>El JWT resultante se almacena en el cliente de forma segura. En las aplicaciones móviles se persiste mediante el mecanismo de almacenamiento seguro provisto por la plataforma (</w:t>
-      </w:r>
-      <w:proofErr w:type="spellStart"/>
-      <w:r>
-        <w:rPr>
-          <w:color w:val="000000"/>
-          <w:sz w:val="24"/>
-        </w:rPr>
-        <w:t>SecureStore</w:t>
-      </w:r>
-      <w:proofErr w:type="spellEnd"/>
-      <w:r>
-        <w:rPr>
-          <w:color w:val="000000"/>
-          <w:sz w:val="24"/>
-        </w:rPr>
-        <w:t xml:space="preserve">), mientras que en el </w:t>
-      </w:r>
-      <w:proofErr w:type="spellStart"/>
-      <w:r>
-        <w:rPr>
-          <w:color w:val="000000"/>
-          <w:sz w:val="24"/>
-        </w:rPr>
-        <w:t>Admin</w:t>
-      </w:r>
-      <w:proofErr w:type="spellEnd"/>
-      <w:r>
-        <w:rPr>
-          <w:color w:val="000000"/>
-          <w:sz w:val="24"/>
-        </w:rPr>
-        <w:t xml:space="preserve"> Panel se emplea el almacenamiento local del navegador (</w:t>
-      </w:r>
-      <w:proofErr w:type="spellStart"/>
-      <w:r>
-        <w:rPr>
-          <w:color w:val="000000"/>
-          <w:sz w:val="24"/>
-        </w:rPr>
-        <w:t>localStorage</w:t>
-      </w:r>
-      <w:proofErr w:type="spellEnd"/>
-      <w:r>
-        <w:rPr>
-          <w:color w:val="000000"/>
-          <w:sz w:val="24"/>
-        </w:rPr>
-        <w:t>). Este almacenamiento permite recuperar la sesión al reabrir la aplicación, tal como se describió en el flujo de navegación (sección 6.4), sin necesidad de volver a autenticar al usuario.</w:t>
+        <w:t>El JWT resultante se almacena en el cliente de forma segura. En las aplicaciones móviles se persiste mediante el mecanismo de almacenamiento seguro provisto por la plataforma (SecureStore), mientras que en el Admin Panel se emplea el almacenamiento local del navegador (localStorage). Este almacenamiento permite recuperar la sesión al reabrir la aplicación, tal como se describió en el flujo de navegación (sección 6.4), sin necesidad de volver a autenticar al usuario.</w:t>
       </w:r>
     </w:p>
     <w:p>
@@ -5988,55 +5155,7 @@
           <w:color w:val="000000"/>
           <w:sz w:val="24"/>
         </w:rPr>
-        <w:t>Como medida adicional de seguridad, el sistema implementa la autenticación de dos factores basada en TOTP (Time-</w:t>
-      </w:r>
-      <w:proofErr w:type="spellStart"/>
-      <w:r>
-        <w:rPr>
-          <w:color w:val="000000"/>
-          <w:sz w:val="24"/>
-        </w:rPr>
-        <w:t>based</w:t>
-      </w:r>
-      <w:proofErr w:type="spellEnd"/>
-      <w:r>
-        <w:rPr>
-          <w:color w:val="000000"/>
-          <w:sz w:val="24"/>
-        </w:rPr>
-        <w:t xml:space="preserve"> </w:t>
-      </w:r>
-      <w:proofErr w:type="spellStart"/>
-      <w:r>
-        <w:rPr>
-          <w:color w:val="000000"/>
-          <w:sz w:val="24"/>
-        </w:rPr>
-        <w:t>One</w:t>
-      </w:r>
-      <w:proofErr w:type="spellEnd"/>
-      <w:r>
-        <w:rPr>
-          <w:color w:val="000000"/>
-          <w:sz w:val="24"/>
-        </w:rPr>
-        <w:t xml:space="preserve">-Time </w:t>
-      </w:r>
-      <w:proofErr w:type="spellStart"/>
-      <w:r>
-        <w:rPr>
-          <w:color w:val="000000"/>
-          <w:sz w:val="24"/>
-        </w:rPr>
-        <w:t>Password</w:t>
-      </w:r>
-      <w:proofErr w:type="spellEnd"/>
-      <w:r>
-        <w:rPr>
-          <w:color w:val="000000"/>
-          <w:sz w:val="24"/>
-        </w:rPr>
-        <w:t>). Tras el inicio de sesión inicial, el sistema solicita un código de un solo uso generado por una aplicación autenticadora. El backend valida el código TOTP contra el secreto registrado del usuario; solo si la verificación es correcta se completa la autenticación y se emite el JWT. Este paso corresponde a la pantalla de verificación en dos pasos del Auth Stack (sección 6.2) y reduce el riesgo asociado al compromiso de una única credencial.</w:t>
+        <w:t>Como medida adicional de seguridad, el sistema implementa la autenticación de dos factores basada en TOTP (Time-based One-Time Password). Tras el inicio de sesión inicial, el sistema solicita un código de un solo uso generado por una aplicación autenticadora. El backend valida el código TOTP contra el secreto registrado del usuario; solo si la verificación es correcta se completa la autenticación y se emite el JWT. Este paso corresponde a la pantalla de verificación en dos pasos del Auth Stack (sección 6.2) y reduce el riesgo asociado al compromiso de una única credencial.</w:t>
       </w:r>
     </w:p>
     <w:p>
@@ -6333,111 +5452,31 @@
           <w:sz w:val="24"/>
           <w:szCs w:val="24"/>
         </w:rPr>
-        <w:t xml:space="preserve">El diagrama de secuencia presenta los actores y componentes involucrados: Usuario, Cliente (móvil/web), Firebase Auth, Backend Spring Boot, Firebase </w:t>
-      </w:r>
-      <w:proofErr w:type="spellStart"/>
-      <w:r>
+        <w:t>El diagrama de secuencia presenta los actores y componentes involucrados: Usuario, Cliente (móvil/web), Firebase Auth, Backend Spring Boot, Firebase Admin SDK y Base de datos SQL Server. Las líneas de vida se ordenan horizontalmente y los mensajes siguen la secuencia: el usuario solicita el inicio de sesión; el cliente obtiene el idToken de Google; el cliente envía el idToken al backend; el backend lo verifica con el Firebase Admin SDK; el sistema solicita y valida el código TOTP del 2FA; el backend genera el JWT; persiste la sesión en la base de datos; y el cliente almacena el JWT de forma segura.</w:t>
+      </w:r>
+    </w:p>
+    <w:p>
+      <w:pPr>
+        <w:spacing w:after="160"/>
+        <w:jc w:val="left"/>
         <w:rPr>
           <w:rFonts w:eastAsia="Times New Roman" w:cs="Times New Roman"/>
           <w:bCs/>
           <w:sz w:val="24"/>
           <w:szCs w:val="24"/>
         </w:rPr>
-        <w:t>Admin</w:t>
-      </w:r>
-      <w:proofErr w:type="spellEnd"/>
-      <w:r>
+      </w:pPr>
+    </w:p>
+    <w:p>
+      <w:pPr>
+        <w:spacing w:after="160"/>
+        <w:jc w:val="left"/>
         <w:rPr>
           <w:rFonts w:eastAsia="Times New Roman" w:cs="Times New Roman"/>
           <w:bCs/>
           <w:sz w:val="24"/>
           <w:szCs w:val="24"/>
         </w:rPr>
-        <w:t xml:space="preserve"> SDK y Base de datos SQL Server. Las líneas de vida se ordenan horizontalmente y los mensajes siguen la secuencia: el usuario solicita el inicio de sesión; el cliente obtiene el </w:t>
-      </w:r>
-      <w:proofErr w:type="spellStart"/>
-      <w:r>
-        <w:rPr>
-          <w:rFonts w:eastAsia="Times New Roman" w:cs="Times New Roman"/>
-          <w:bCs/>
-          <w:sz w:val="24"/>
-          <w:szCs w:val="24"/>
-        </w:rPr>
-        <w:t>idToken</w:t>
-      </w:r>
-      <w:proofErr w:type="spellEnd"/>
-      <w:r>
-        <w:rPr>
-          <w:rFonts w:eastAsia="Times New Roman" w:cs="Times New Roman"/>
-          <w:bCs/>
-          <w:sz w:val="24"/>
-          <w:szCs w:val="24"/>
-        </w:rPr>
-        <w:t xml:space="preserve"> de Google; el cliente envía el </w:t>
-      </w:r>
-      <w:proofErr w:type="spellStart"/>
-      <w:r>
-        <w:rPr>
-          <w:rFonts w:eastAsia="Times New Roman" w:cs="Times New Roman"/>
-          <w:bCs/>
-          <w:sz w:val="24"/>
-          <w:szCs w:val="24"/>
-        </w:rPr>
-        <w:t>idToken</w:t>
-      </w:r>
-      <w:proofErr w:type="spellEnd"/>
-      <w:r>
-        <w:rPr>
-          <w:rFonts w:eastAsia="Times New Roman" w:cs="Times New Roman"/>
-          <w:bCs/>
-          <w:sz w:val="24"/>
-          <w:szCs w:val="24"/>
-        </w:rPr>
-        <w:t xml:space="preserve"> al backend; el backend lo verifica con el Firebase </w:t>
-      </w:r>
-      <w:proofErr w:type="spellStart"/>
-      <w:r>
-        <w:rPr>
-          <w:rFonts w:eastAsia="Times New Roman" w:cs="Times New Roman"/>
-          <w:bCs/>
-          <w:sz w:val="24"/>
-          <w:szCs w:val="24"/>
-        </w:rPr>
-        <w:t>Admin</w:t>
-      </w:r>
-      <w:proofErr w:type="spellEnd"/>
-      <w:r>
-        <w:rPr>
-          <w:rFonts w:eastAsia="Times New Roman" w:cs="Times New Roman"/>
-          <w:bCs/>
-          <w:sz w:val="24"/>
-          <w:szCs w:val="24"/>
-        </w:rPr>
-        <w:t xml:space="preserve"> SDK; el sistema solicita y valida el código TOTP del 2FA; el backend genera el JWT; persiste la sesión en la base de datos; y el cliente almacena el JWT de forma segura.</w:t>
-      </w:r>
-    </w:p>
-    <w:p>
-      <w:pPr>
-        <w:spacing w:after="160"/>
-        <w:jc w:val="left"/>
-        <w:rPr>
-          <w:rFonts w:eastAsia="Times New Roman" w:cs="Times New Roman"/>
-          <w:bCs/>
-          <w:sz w:val="24"/>
-          <w:szCs w:val="24"/>
-        </w:rPr>
-      </w:pPr>
-    </w:p>
-    <w:p>
-      <w:pPr>
-        <w:spacing w:after="160"/>
-        <w:jc w:val="left"/>
-        <w:rPr>
-          <w:rFonts w:eastAsia="Times New Roman" w:cs="Times New Roman"/>
-          <w:bCs/>
-          <w:sz w:val="24"/>
-          <w:szCs w:val="24"/>
-        </w:rPr>
       </w:pPr>
     </w:p>
     <w:p>
@@ -6463,23 +5502,7 @@
           <w:color w:val="000000"/>
           <w:sz w:val="24"/>
         </w:rPr>
-        <w:t xml:space="preserve">Los clientes de Wani Connect estructuran su interfaz en componentes reutilizables y en contextos de estado global que coordinan la información compartida entre pantallas. Esta sección describe los contextos de estado global y la organización jerárquica de componentes y pantallas, incluido el </w:t>
-      </w:r>
-      <w:proofErr w:type="spellStart"/>
-      <w:r>
-        <w:rPr>
-          <w:color w:val="000000"/>
-          <w:sz w:val="24"/>
-        </w:rPr>
-        <w:t>Admin</w:t>
-      </w:r>
-      <w:proofErr w:type="spellEnd"/>
-      <w:r>
-        <w:rPr>
-          <w:color w:val="000000"/>
-          <w:sz w:val="24"/>
-        </w:rPr>
-        <w:t xml:space="preserve"> Panel, tomando como base el patrón MVE de la sección 2.</w:t>
+        <w:t>Los clientes de Wani Connect estructuran su interfaz en componentes reutilizables y en contextos de estado global que coordinan la información compartida entre pantallas. Esta sección describe los contextos de estado global y la organización jerárquica de componentes y pantallas, incluido el Admin Panel, tomando como base el patrón MVE de la sección 2.</w:t>
       </w:r>
     </w:p>
     <w:p>
@@ -6520,85 +5543,42 @@
           <w:sz w:val="24"/>
         </w:rPr>
       </w:pPr>
-      <w:proofErr w:type="spellStart"/>
-      <w:r>
-        <w:rPr>
-          <w:color w:val="000000"/>
-          <w:sz w:val="24"/>
-        </w:rPr>
-        <w:t>AuthContext</w:t>
-      </w:r>
-      <w:proofErr w:type="spellEnd"/>
-      <w:r>
-        <w:rPr>
-          <w:color w:val="000000"/>
-          <w:sz w:val="24"/>
-        </w:rPr>
-        <w:t xml:space="preserve">: gestiona el estado de autenticación del usuario (sesión iniciada o no), el token JWT almacenado (sección 7.5) y las operaciones de inicio y cierre de sesión. Su estado determina la navegación entre el Auth Stack y el Tab </w:t>
-      </w:r>
-      <w:proofErr w:type="spellStart"/>
-      <w:r>
-        <w:rPr>
-          <w:color w:val="000000"/>
-          <w:sz w:val="24"/>
-        </w:rPr>
-        <w:t>Navigator</w:t>
-      </w:r>
-      <w:proofErr w:type="spellEnd"/>
-      <w:r>
-        <w:rPr>
-          <w:color w:val="000000"/>
-          <w:sz w:val="24"/>
-        </w:rPr>
-        <w:t xml:space="preserve"> (sección 6.4).</w:t>
-      </w:r>
-    </w:p>
-    <w:p>
-      <w:pPr>
-        <w:rPr>
-          <w:color w:val="000000"/>
-          <w:sz w:val="24"/>
-        </w:rPr>
-      </w:pPr>
-      <w:proofErr w:type="spellStart"/>
-      <w:r>
-        <w:rPr>
-          <w:color w:val="000000"/>
-          <w:sz w:val="24"/>
-        </w:rPr>
-        <w:t>LangContext</w:t>
-      </w:r>
-      <w:proofErr w:type="spellEnd"/>
-      <w:r>
-        <w:rPr>
-          <w:color w:val="000000"/>
-          <w:sz w:val="24"/>
-        </w:rPr>
-        <w:t>: administra el idioma seleccionado por el usuario y las traducciones de la interfaz. Permite presentar el contenido en distintos idiomas de manera dinámica, sin necesidad de recargar la aplicación.</w:t>
-      </w:r>
-    </w:p>
-    <w:p>
-      <w:pPr>
-        <w:rPr>
-          <w:color w:val="000000"/>
-          <w:sz w:val="24"/>
-        </w:rPr>
-      </w:pPr>
-      <w:proofErr w:type="spellStart"/>
-      <w:r>
-        <w:rPr>
-          <w:color w:val="000000"/>
-          <w:sz w:val="24"/>
-        </w:rPr>
-        <w:t>ThemeContext</w:t>
-      </w:r>
-      <w:proofErr w:type="spellEnd"/>
-      <w:r>
-        <w:rPr>
-          <w:color w:val="000000"/>
-          <w:sz w:val="24"/>
-        </w:rPr>
-        <w:t>: administra el tema visual de la aplicación (por ejemplo, modo claro u oscuro) y centraliza la configuración de estilos, garantizando una apariencia coherente en todos los componentes.</w:t>
+      <w:r>
+        <w:rPr>
+          <w:color w:val="000000"/>
+          <w:sz w:val="24"/>
+        </w:rPr>
+        <w:t>AuthContext: gestiona el estado de autenticación del usuario (sesión iniciada o no), el token JWT almacenado (sección 7.5) y las operaciones de inicio y cierre de sesión. Su estado determina la navegación entre el Auth Stack y el Tab Navigator (sección 6.4).</w:t>
+      </w:r>
+    </w:p>
+    <w:p>
+      <w:pPr>
+        <w:rPr>
+          <w:color w:val="000000"/>
+          <w:sz w:val="24"/>
+        </w:rPr>
+      </w:pPr>
+      <w:r>
+        <w:rPr>
+          <w:color w:val="000000"/>
+          <w:sz w:val="24"/>
+        </w:rPr>
+        <w:t>LangContext: administra el idioma seleccionado por el usuario y las traducciones de la interfaz. Permite presentar el contenido en distintos idiomas de manera dinámica, sin necesidad de recargar la aplicación.</w:t>
+      </w:r>
+    </w:p>
+    <w:p>
+      <w:pPr>
+        <w:rPr>
+          <w:color w:val="000000"/>
+          <w:sz w:val="24"/>
+        </w:rPr>
+      </w:pPr>
+      <w:r>
+        <w:rPr>
+          <w:color w:val="000000"/>
+          <w:sz w:val="24"/>
+        </w:rPr>
+        <w:t>ThemeContext: administra el tema visual de la aplicación (por ejemplo, modo claro u oscuro) y centraliza la configuración de estilos, garantizando una apariencia coherente en todos los componentes.</w:t>
       </w:r>
     </w:p>
     <w:p>
@@ -6629,23 +5609,7 @@
           <w:color w:val="000000"/>
           <w:sz w:val="24"/>
         </w:rPr>
-        <w:t xml:space="preserve">Los componentes se organizan jerárquicamente: los contextos se ubican en el nivel más alto, envolviendo a los componentes de navegación (sección 6); a partir de ahí, cada pantalla compone sus elementos a partir de los componentes reutilizables definidos en la carpeta </w:t>
-      </w:r>
-      <w:proofErr w:type="spellStart"/>
-      <w:r>
-        <w:rPr>
-          <w:color w:val="000000"/>
-          <w:sz w:val="24"/>
-        </w:rPr>
-        <w:t>components</w:t>
-      </w:r>
-      <w:proofErr w:type="spellEnd"/>
-      <w:r>
-        <w:rPr>
-          <w:color w:val="000000"/>
-          <w:sz w:val="24"/>
-        </w:rPr>
-        <w:t xml:space="preserve"> (sección 5.2). Esta jerarquía permite que los contextos globales estén disponibles en todas las pantallas y que los componentes de interfaz se mantengan pequeños, específicos y reutilizables, lo que favorece la mantenibilidad y la reutilización de código.</w:t>
+        <w:t>Los componentes se organizan jerárquicamente: los contextos se ubican en el nivel más alto, envolviendo a los componentes de navegación (sección 6); a partir de ahí, cada pantalla compone sus elementos a partir de los componentes reutilizables definidos en la carpeta components (sección 5.2). Esta jerarquía permite que los contextos globales estén disponibles en todas las pantallas y que los componentes de interfaz se mantengan pequeños, específicos y reutilizables, lo que favorece la mantenibilidad y la reutilización de código.</w:t>
       </w:r>
       <w:r>
         <w:rPr>
@@ -6695,72 +5659,22 @@
           <w:color w:val="000000"/>
           <w:sz w:val="24"/>
         </w:rPr>
-        <w:t xml:space="preserve">. Estructura del </w:t>
-      </w:r>
-      <w:proofErr w:type="spellStart"/>
-      <w:r>
-        <w:rPr>
-          <w:b/>
-          <w:color w:val="000000"/>
-          <w:sz w:val="24"/>
-        </w:rPr>
-        <w:t>Admin</w:t>
-      </w:r>
-      <w:proofErr w:type="spellEnd"/>
-      <w:r>
-        <w:rPr>
-          <w:b/>
-          <w:color w:val="000000"/>
-          <w:sz w:val="24"/>
-        </w:rPr>
-        <w:t xml:space="preserve"> Panel</w:t>
-      </w:r>
-    </w:p>
-    <w:p>
-      <w:pPr>
-        <w:rPr>
-          <w:color w:val="000000"/>
-          <w:sz w:val="24"/>
-        </w:rPr>
-      </w:pPr>
-      <w:r>
-        <w:rPr>
-          <w:color w:val="000000"/>
-          <w:sz w:val="24"/>
-        </w:rPr>
-        <w:t xml:space="preserve">El </w:t>
-      </w:r>
-      <w:proofErr w:type="spellStart"/>
-      <w:r>
-        <w:rPr>
-          <w:color w:val="000000"/>
-          <w:sz w:val="24"/>
-        </w:rPr>
-        <w:t>Admin</w:t>
-      </w:r>
-      <w:proofErr w:type="spellEnd"/>
-      <w:r>
-        <w:rPr>
-          <w:color w:val="000000"/>
-          <w:sz w:val="24"/>
-        </w:rPr>
-        <w:t xml:space="preserve"> Panel aplica la misma organización jerárquica de contextos y componentes, pero añade la capa administrativa que gestiona eventos, emprendimientos y usuarios. Los contextos (Auth, Lang y </w:t>
-      </w:r>
-      <w:proofErr w:type="spellStart"/>
-      <w:r>
-        <w:rPr>
-          <w:color w:val="000000"/>
-          <w:sz w:val="24"/>
-        </w:rPr>
-        <w:t>Theme</w:t>
-      </w:r>
-      <w:proofErr w:type="spellEnd"/>
-      <w:r>
-        <w:rPr>
-          <w:color w:val="000000"/>
-          <w:sz w:val="24"/>
-        </w:rPr>
-        <w:t>) se comparten con los clientes móviles para mantener una fuente de estado consistente. Las pantallas administrativas se ubican en la correspondiente carpeta de pantallas (sección 5.3) y reutilizan los componentes comunes, complementándolos con componentes administrativos específicos.</w:t>
+        <w:t>. Estructura del Admin Panel</w:t>
+      </w:r>
+    </w:p>
+    <w:p>
+      <w:pPr>
+        <w:rPr>
+          <w:color w:val="000000"/>
+          <w:sz w:val="24"/>
+        </w:rPr>
+      </w:pPr>
+      <w:r>
+        <w:rPr>
+          <w:color w:val="000000"/>
+          <w:sz w:val="24"/>
+        </w:rPr>
+        <w:t>El Admin Panel aplica la misma organización jerárquica de contextos y componentes, pero añade la capa administrativa que gestiona eventos, emprendimientos y usuarios. Los contextos (Auth, Lang y Theme) se comparten con los clientes móviles para mantener una fuente de estado consistente. Las pantallas administrativas se ubican en la correspondiente carpeta de pantallas (sección 5.3) y reutilizan los componentes comunes, complementándolos con componentes administrativos específicos.</w:t>
       </w:r>
     </w:p>
     <w:p>
@@ -6914,31 +5828,7 @@
     </w:p>
     <w:p>
       <w:r>
-        <w:t>El diagrama presenta en la raíz a los tres contextos globales (</w:t>
-      </w:r>
-      <w:proofErr w:type="spellStart"/>
-      <w:r>
-        <w:t>AuthContext</w:t>
-      </w:r>
-      <w:proofErr w:type="spellEnd"/>
-      <w:r>
-        <w:t xml:space="preserve">, </w:t>
-      </w:r>
-      <w:proofErr w:type="spellStart"/>
-      <w:r>
-        <w:t>LangContext</w:t>
-      </w:r>
-      <w:proofErr w:type="spellEnd"/>
-      <w:r>
-        <w:t xml:space="preserve"> y </w:t>
-      </w:r>
-      <w:proofErr w:type="spellStart"/>
-      <w:r>
-        <w:t>ThemeContext</w:t>
-      </w:r>
-      <w:proofErr w:type="spellEnd"/>
-      <w:r>
-        <w:t xml:space="preserve">), que envuelven al navegador. Debajo del navegador se ubican las pantallas, y bajo cada pantalla los componentes reutilizables. Las líneas de contención indican cómo los </w:t>
+        <w:t xml:space="preserve">El diagrama presenta en la raíz a los tres contextos globales (AuthContext, LangContext y ThemeContext), que envuelven al navegador. Debajo del navegador se ubican las pantallas, y bajo cada pantalla los componentes reutilizables. Las líneas de contención indican cómo los </w:t>
       </w:r>
       <w:r>
         <w:lastRenderedPageBreak/>
@@ -7012,23 +5902,7 @@
           <w:color w:val="000000"/>
           <w:sz w:val="24"/>
         </w:rPr>
-        <w:t xml:space="preserve"> canónicos (GET, POST, PUT y DELETE) y el cuerpo de las peticiones y respuestas se serializa en formato JSON. Los recursos se identifican mediante </w:t>
-      </w:r>
-      <w:proofErr w:type="spellStart"/>
-      <w:r>
-        <w:rPr>
-          <w:color w:val="000000"/>
-          <w:sz w:val="24"/>
-        </w:rPr>
-        <w:t>URLs</w:t>
-      </w:r>
-      <w:proofErr w:type="spellEnd"/>
-      <w:r>
-        <w:rPr>
-          <w:color w:val="000000"/>
-          <w:sz w:val="24"/>
-        </w:rPr>
-        <w:t xml:space="preserve"> con una estructura jerárquica, y las respuestas incluyen los datos solicitados o el resultado de la operación en formato JSON. Este enfoque, ampliamente adoptado, es compatible con los tres tipos de cliente y facilita la interoperabilidad entre las plataformas.</w:t>
+        <w:t xml:space="preserve"> canónicos (GET, POST, PUT y DELETE) y el cuerpo de las peticiones y respuestas se serializa en formato JSON. Los recursos se identifican mediante URLs con una estructura jerárquica, y las respuestas incluyen los datos solicitados o el resultado de la operación en formato JSON. Este enfoque, ampliamente adoptado, es compatible con los tres tipos de cliente y facilita la interoperabilidad entre las plataformas.</w:t>
       </w:r>
     </w:p>
     <w:p>
@@ -7059,39 +5933,7 @@
           <w:color w:val="000000"/>
           <w:sz w:val="24"/>
         </w:rPr>
-        <w:t xml:space="preserve">Los endpoints del sistema se agrupan en módulos según su dominio funcional. El módulo de autenticación (Auth) agrupa los servicios de inicio de sesión, verificación y generación de token descritos en la sección 7. El módulo de Usuario expone las operaciones de gestión del perfil y de la información del usuario autenticado. El módulo de Evento gestiona la creación, consulta y administración de los eventos disponibles. El módulo de Emprendimiento expone las operaciones relacionadas con los emprendimientos registrados. El módulo de Foto gestiona la carga y recuperación de imágenes asociadas a los eventos y emprendimientos. Por último, el módulo </w:t>
-      </w:r>
-      <w:proofErr w:type="spellStart"/>
-      <w:r>
-        <w:rPr>
-          <w:color w:val="000000"/>
-          <w:sz w:val="24"/>
-        </w:rPr>
-        <w:t>AdminEvento</w:t>
-      </w:r>
-      <w:proofErr w:type="spellEnd"/>
-      <w:r>
-        <w:rPr>
-          <w:color w:val="000000"/>
-          <w:sz w:val="24"/>
-        </w:rPr>
-        <w:t xml:space="preserve"> agrupa las operaciones administrativas sobre los eventos, destinadas exclusivamente al rol administrativo del </w:t>
-      </w:r>
-      <w:proofErr w:type="spellStart"/>
-      <w:r>
-        <w:rPr>
-          <w:color w:val="000000"/>
-          <w:sz w:val="24"/>
-        </w:rPr>
-        <w:t>Admin</w:t>
-      </w:r>
-      <w:proofErr w:type="spellEnd"/>
-      <w:r>
-        <w:rPr>
-          <w:color w:val="000000"/>
-          <w:sz w:val="24"/>
-        </w:rPr>
-        <w:t xml:space="preserve"> Panel (sección 5.3).</w:t>
+        <w:t>Los endpoints del sistema se agrupan en módulos según su dominio funcional. El módulo de autenticación (Auth) agrupa los servicios de inicio de sesión, verificación y generación de token descritos en la sección 7. El módulo de Usuario expone las operaciones de gestión del perfil y de la información del usuario autenticado. El módulo de Evento gestiona la creación, consulta y administración de los eventos disponibles. El módulo de Emprendimiento expone las operaciones relacionadas con los emprendimientos registrados. El módulo de Foto gestiona la carga y recuperación de imágenes asociadas a los eventos y emprendimientos. Por último, el módulo AdminEvento agrupa las operaciones administrativas sobre los eventos, destinadas exclusivamente al rol administrativo del Admin Panel (sección 5.3).</w:t>
       </w:r>
     </w:p>
     <w:p>
@@ -7149,87 +5991,7 @@
           <w:color w:val="000000"/>
           <w:sz w:val="24"/>
         </w:rPr>
-        <w:t>El sistema respeta la semántica estándar de los códigos de estado HTTP. Las respuestas exitosas emplean los códigos 200 (OK) y 201 (</w:t>
-      </w:r>
-      <w:proofErr w:type="spellStart"/>
-      <w:r>
-        <w:rPr>
-          <w:color w:val="000000"/>
-          <w:sz w:val="24"/>
-        </w:rPr>
-        <w:t>Created</w:t>
-      </w:r>
-      <w:proofErr w:type="spellEnd"/>
-      <w:r>
-        <w:rPr>
-          <w:color w:val="000000"/>
-          <w:sz w:val="24"/>
-        </w:rPr>
-        <w:t xml:space="preserve">). Las peticiones mal formadas responden con 400 (Bad </w:t>
-      </w:r>
-      <w:proofErr w:type="spellStart"/>
-      <w:r>
-        <w:rPr>
-          <w:color w:val="000000"/>
-          <w:sz w:val="24"/>
-        </w:rPr>
-        <w:t>Request</w:t>
-      </w:r>
-      <w:proofErr w:type="spellEnd"/>
-      <w:r>
-        <w:rPr>
-          <w:color w:val="000000"/>
-          <w:sz w:val="24"/>
-        </w:rPr>
-        <w:t>). Las peticiones que requieren autenticación fallan con 401 (</w:t>
-      </w:r>
-      <w:proofErr w:type="spellStart"/>
-      <w:r>
-        <w:rPr>
-          <w:color w:val="000000"/>
-          <w:sz w:val="24"/>
-        </w:rPr>
-        <w:t>Unauthorized</w:t>
-      </w:r>
-      <w:proofErr w:type="spellEnd"/>
-      <w:r>
-        <w:rPr>
-          <w:color w:val="000000"/>
-          <w:sz w:val="24"/>
-        </w:rPr>
-        <w:t>), y las que violan los permisos del rol responden con 403 (</w:t>
-      </w:r>
-      <w:proofErr w:type="spellStart"/>
-      <w:r>
-        <w:rPr>
-          <w:color w:val="000000"/>
-          <w:sz w:val="24"/>
-        </w:rPr>
-        <w:t>Forbidden</w:t>
-      </w:r>
-      <w:proofErr w:type="spellEnd"/>
-      <w:r>
-        <w:rPr>
-          <w:color w:val="000000"/>
-          <w:sz w:val="24"/>
-        </w:rPr>
-        <w:t>). Las solicitudes sobre recursos inexistentes devuelven 404 (Not Found). Los errores internos del servidor se reportan con 500 (</w:t>
-      </w:r>
-      <w:proofErr w:type="spellStart"/>
-      <w:r>
-        <w:rPr>
-          <w:color w:val="000000"/>
-          <w:sz w:val="24"/>
-        </w:rPr>
-        <w:t>Internal</w:t>
-      </w:r>
-      <w:proofErr w:type="spellEnd"/>
-      <w:r>
-        <w:rPr>
-          <w:color w:val="000000"/>
-          <w:sz w:val="24"/>
-        </w:rPr>
-        <w:t xml:space="preserve"> Server Error). El backend enmascara los errores internos y entrega una respuesta JSON estructurada que describe la naturaleza del error, de modo que los clientes puedan manejarlo de forma uniforme mediante el interceptor descrito en la sección 7.6.</w:t>
+        <w:t>El sistema respeta la semántica estándar de los códigos de estado HTTP. Las respuestas exitosas emplean los códigos 200 (OK) y 201 (Created). Las peticiones mal formadas responden con 400 (Bad Request). Las peticiones que requieren autenticación fallan con 401 (Unauthorized), y las que violan los permisos del rol responden con 403 (Forbidden). Las solicitudes sobre recursos inexistentes devuelven 404 (Not Found). Los errores internos del servidor se reportan con 500 (Internal Server Error). El backend enmascara los errores internos y entrega una respuesta JSON estructurada que describe la naturaleza del error, de modo que los clientes puedan manejarlo de forma uniforme mediante el interceptor descrito en la sección 7.6.</w:t>
       </w:r>
     </w:p>
     <w:p>
@@ -7401,55 +6163,7 @@
           <w:color w:val="000000"/>
           <w:sz w:val="24"/>
         </w:rPr>
-        <w:t xml:space="preserve">El diagrama representa a los clientes (móviles y </w:t>
-      </w:r>
-      <w:proofErr w:type="spellStart"/>
-      <w:r>
-        <w:rPr>
-          <w:color w:val="000000"/>
-          <w:sz w:val="24"/>
-        </w:rPr>
-        <w:t>Admin</w:t>
-      </w:r>
-      <w:proofErr w:type="spellEnd"/>
-      <w:r>
-        <w:rPr>
-          <w:color w:val="000000"/>
-          <w:sz w:val="24"/>
-        </w:rPr>
-        <w:t xml:space="preserve"> Panel) conectados mediante el API Gateway al backend. Del backend parten los controladores agrupados por módulo (Auth, Usuario, Evento, Emprendimiento, Foto y </w:t>
-      </w:r>
-      <w:proofErr w:type="spellStart"/>
-      <w:r>
-        <w:rPr>
-          <w:color w:val="000000"/>
-          <w:sz w:val="24"/>
-        </w:rPr>
-        <w:t>AdminEvento</w:t>
-      </w:r>
-      <w:proofErr w:type="spellEnd"/>
-      <w:r>
-        <w:rPr>
-          <w:color w:val="000000"/>
-          <w:sz w:val="24"/>
-        </w:rPr>
-        <w:t xml:space="preserve">), que a su vez se conectan con la capa de servicios de acuerdo con la estructura de la sección 3.2. El módulo </w:t>
-      </w:r>
-      <w:proofErr w:type="spellStart"/>
-      <w:r>
-        <w:rPr>
-          <w:color w:val="000000"/>
-          <w:sz w:val="24"/>
-        </w:rPr>
-        <w:t>AdminEvento</w:t>
-      </w:r>
-      <w:proofErr w:type="spellEnd"/>
-      <w:r>
-        <w:rPr>
-          <w:color w:val="000000"/>
-          <w:sz w:val="24"/>
-        </w:rPr>
-        <w:t xml:space="preserve"> queda restringido al rol administrativo.</w:t>
+        <w:t>El diagrama representa a los clientes (móviles y Admin Panel) conectados mediante el API Gateway al backend. Del backend parten los controladores agrupados por módulo (Auth, Usuario, Evento, Emprendimiento, Foto y AdminEvento), que a su vez se conectan con la capa de servicios de acuerdo con la estructura de la sección 3.2. El módulo AdminEvento queda restringido al rol administrativo.</w:t>
       </w:r>
     </w:p>
     <w:p>
@@ -13510,12 +12224,6 @@
 </file>
 
 <file path=customXml/item1.xml><?xml version="1.0" encoding="utf-8"?>
-<go:gDocsCustomXmlDataStorage xmlns:go="http://customooxmlschemas.google.com/" xmlns:r="http://schemas.openxmlformats.org/officeDocument/2006/relationships" uri="GoogleDocsCustomDataVersion2">
-  <go:docsCustomData xmlns:go="http://customooxmlschemas.google.com/" roundtripDataSignature="AMtx7mi9d+hB7Yr5xbgsLmNWLWBp+ZE0pA==">CgMxLjAyDmgucTN2NzA2eG5kbmd2Mg5oLmt3bTJka3VkZzlmejgAciExQXU0QTJUc0Z4RFFfZjVvQkJHWk1rcEIzQ01SMG5jazY=</go:docsCustomData>
-</go:gDocsCustomXmlDataStorage>
-</file>
-
-<file path=customXml/item2.xml><?xml version="1.0" encoding="utf-8"?>
 <b:Sources xmlns:b="http://schemas.openxmlformats.org/officeDocument/2006/bibliography" xmlns="http://schemas.openxmlformats.org/officeDocument/2006/bibliography" SelectedStyle="\APASixthEditionOfficeOnline.xsl" StyleName="APA" Version="6">
   <b:Source>
     <b:Tag>Exp26</b:Tag>
@@ -13612,19 +12320,25 @@
 </b:Sources>
 </file>
 
+<file path=customXml/item2.xml><?xml version="1.0" encoding="utf-8"?>
+<go:gDocsCustomXmlDataStorage xmlns:go="http://customooxmlschemas.google.com/" xmlns:r="http://schemas.openxmlformats.org/officeDocument/2006/relationships" uri="GoogleDocsCustomDataVersion2">
+  <go:docsCustomData xmlns:go="http://customooxmlschemas.google.com/" roundtripDataSignature="AMtx7mi9d+hB7Yr5xbgsLmNWLWBp+ZE0pA==">CgMxLjAyDmgucTN2NzA2eG5kbmd2Mg5oLmt3bTJka3VkZzlmejgAciExQXU0QTJUc0Z4RFFfZjVvQkJHWk1rcEIzQ01SMG5jazY=</go:docsCustomData>
+</go:gDocsCustomXmlDataStorage>
+</file>
+
 <file path=customXml/itemProps1.xml><?xml version="1.0" encoding="utf-8"?>
+<ds:datastoreItem xmlns:ds="http://schemas.openxmlformats.org/officeDocument/2006/customXml" ds:itemID="{B9A3AC92-EB64-40EC-B9FC-D65B11329118}">
+  <ds:schemaRefs>
+    <ds:schemaRef ds:uri="http://schemas.openxmlformats.org/officeDocument/2006/bibliography"/>
+  </ds:schemaRefs>
+</ds:datastoreItem>
+</file>
+
+<file path=customXml/itemProps2.xml><?xml version="1.0" encoding="utf-8"?>
 <ds:datastoreItem xmlns:ds="http://schemas.openxmlformats.org/officeDocument/2006/customXml" ds:itemID="{11111111-1234-1234-1234-123412341234}">
   <ds:schemaRefs>
     <ds:schemaRef ds:uri="http://customooxmlschemas.google.com/"/>
     <ds:schemaRef ds:uri="http://schemas.openxmlformats.org/officeDocument/2006/relationships"/>
   </ds:schemaRefs>
 </ds:datastoreItem>
-</file>
-
-<file path=customXml/itemProps2.xml><?xml version="1.0" encoding="utf-8"?>
-<ds:datastoreItem xmlns:ds="http://schemas.openxmlformats.org/officeDocument/2006/customXml" ds:itemID="{B9A3AC92-EB64-40EC-B9FC-D65B11329118}">
-  <ds:schemaRefs>
-    <ds:schemaRef ds:uri="http://schemas.openxmlformats.org/officeDocument/2006/bibliography"/>
-  </ds:schemaRefs>
-</ds:datastoreItem>
 </file>
</xml_diff>

<commit_message>
docs: actualizar la documentacion tecnica, los manuales y la presentacion a la identidad Wani Connect, agregar el documento de despliegue de produccion y retirar los artefactos de texto obsoletos
</commit_message>
<xml_diff>
--- a/Documents/ARC - 001 - Wani_Connect_Arquitectura.docx
+++ b/Documents/ARC - 001 - Wani_Connect_Arquitectura.docx
@@ -231,7 +231,7 @@
           <w:sz w:val="36"/>
           <w:szCs w:val="36"/>
         </w:rPr>
-        <w:t>The Stallions Team</w:t>
+        <w:t>Wani Connect</w:t>
       </w:r>
     </w:p>
     <w:p>
@@ -12224,6 +12224,12 @@
 </file>
 
 <file path=customXml/item1.xml><?xml version="1.0" encoding="utf-8"?>
+<go:gDocsCustomXmlDataStorage xmlns:go="http://customooxmlschemas.google.com/" xmlns:r="http://schemas.openxmlformats.org/officeDocument/2006/relationships" uri="GoogleDocsCustomDataVersion2">
+  <go:docsCustomData xmlns:go="http://customooxmlschemas.google.com/" roundtripDataSignature="AMtx7mi9d+hB7Yr5xbgsLmNWLWBp+ZE0pA==">CgMxLjAyDmgucTN2NzA2eG5kbmd2Mg5oLmt3bTJka3VkZzlmejgAciExQXU0QTJUc0Z4RFFfZjVvQkJHWk1rcEIzQ01SMG5jazY=</go:docsCustomData>
+</go:gDocsCustomXmlDataStorage>
+</file>
+
+<file path=customXml/item2.xml><?xml version="1.0" encoding="utf-8"?>
 <b:Sources xmlns:b="http://schemas.openxmlformats.org/officeDocument/2006/bibliography" xmlns="http://schemas.openxmlformats.org/officeDocument/2006/bibliography" SelectedStyle="\APASixthEditionOfficeOnline.xsl" StyleName="APA" Version="6">
   <b:Source>
     <b:Tag>Exp26</b:Tag>
@@ -12320,25 +12326,19 @@
 </b:Sources>
 </file>
 
-<file path=customXml/item2.xml><?xml version="1.0" encoding="utf-8"?>
-<go:gDocsCustomXmlDataStorage xmlns:go="http://customooxmlschemas.google.com/" xmlns:r="http://schemas.openxmlformats.org/officeDocument/2006/relationships" uri="GoogleDocsCustomDataVersion2">
-  <go:docsCustomData xmlns:go="http://customooxmlschemas.google.com/" roundtripDataSignature="AMtx7mi9d+hB7Yr5xbgsLmNWLWBp+ZE0pA==">CgMxLjAyDmgucTN2NzA2eG5kbmd2Mg5oLmt3bTJka3VkZzlmejgAciExQXU0QTJUc0Z4RFFfZjVvQkJHWk1rcEIzQ01SMG5jazY=</go:docsCustomData>
-</go:gDocsCustomXmlDataStorage>
-</file>
-
 <file path=customXml/itemProps1.xml><?xml version="1.0" encoding="utf-8"?>
-<ds:datastoreItem xmlns:ds="http://schemas.openxmlformats.org/officeDocument/2006/customXml" ds:itemID="{B9A3AC92-EB64-40EC-B9FC-D65B11329118}">
-  <ds:schemaRefs>
-    <ds:schemaRef ds:uri="http://schemas.openxmlformats.org/officeDocument/2006/bibliography"/>
-  </ds:schemaRefs>
-</ds:datastoreItem>
-</file>
-
-<file path=customXml/itemProps2.xml><?xml version="1.0" encoding="utf-8"?>
 <ds:datastoreItem xmlns:ds="http://schemas.openxmlformats.org/officeDocument/2006/customXml" ds:itemID="{11111111-1234-1234-1234-123412341234}">
   <ds:schemaRefs>
     <ds:schemaRef ds:uri="http://customooxmlschemas.google.com/"/>
     <ds:schemaRef ds:uri="http://schemas.openxmlformats.org/officeDocument/2006/relationships"/>
   </ds:schemaRefs>
 </ds:datastoreItem>
+</file>
+
+<file path=customXml/itemProps2.xml><?xml version="1.0" encoding="utf-8"?>
+<ds:datastoreItem xmlns:ds="http://schemas.openxmlformats.org/officeDocument/2006/customXml" ds:itemID="{B9A3AC92-EB64-40EC-B9FC-D65B11329118}">
+  <ds:schemaRefs>
+    <ds:schemaRef ds:uri="http://schemas.openxmlformats.org/officeDocument/2006/bibliography"/>
+  </ds:schemaRefs>
+</ds:datastoreItem>
 </file>
</xml_diff>